<commit_message>
update tests results for parser with ai
</commit_message>
<xml_diff>
--- a/tests/doc/test_results.docx
+++ b/tests/doc/test_results.docx
@@ -71,15 +71,25 @@
                 <w:rFonts w:ascii="Times New Roman" w:hAnsi="Times New Roman" w:cs="Times New Roman"/>
                 <w:sz w:val="24"/>
                 <w:szCs w:val="24"/>
-              </w:rPr>
-            </w:pPr>
-            <w:r>
-              <w:rPr>
-                <w:rFonts w:ascii="Times New Roman" w:hAnsi="Times New Roman" w:cs="Times New Roman"/>
-                <w:sz w:val="24"/>
-                <w:szCs w:val="24"/>
-              </w:rPr>
-              <w:t>10</w:t>
+                <w:lang w:val="en-US"/>
+              </w:rPr>
+            </w:pPr>
+            <w:r>
+              <w:rPr>
+                <w:rFonts w:ascii="Times New Roman" w:hAnsi="Times New Roman" w:cs="Times New Roman"/>
+                <w:sz w:val="24"/>
+                <w:szCs w:val="24"/>
+              </w:rPr>
+              <w:t>1</w:t>
+            </w:r>
+            <w:r>
+              <w:rPr>
+                <w:rFonts w:ascii="Times New Roman" w:hAnsi="Times New Roman" w:cs="Times New Roman"/>
+                <w:sz w:val="24"/>
+                <w:szCs w:val="24"/>
+                <w:lang w:val="en-US"/>
+              </w:rPr>
+              <w:t>5</w:t>
             </w:r>
           </w:p>
         </w:tc>
@@ -125,7 +135,7 @@
                 <w:sz w:val="24"/>
                 <w:szCs w:val="24"/>
               </w:rPr>
-              <w:t>10</w:t>
+              <w:t>15</w:t>
             </w:r>
           </w:p>
         </w:tc>
@@ -242,6 +252,7 @@
                 <w:rFonts w:ascii="Times New Roman" w:hAnsi="Times New Roman" w:cs="Times New Roman"/>
                 <w:sz w:val="24"/>
                 <w:szCs w:val="24"/>
+                <w:lang w:val="en-US"/>
               </w:rPr>
             </w:pPr>
             <w:r>
@@ -259,22 +270,105 @@
                 <w:sz w:val="24"/>
                 <w:szCs w:val="24"/>
               </w:rPr>
-              <w:t>покрытия кода (</w:t>
-            </w:r>
-            <w:r>
-              <w:rPr>
-                <w:rFonts w:ascii="Times New Roman" w:hAnsi="Times New Roman" w:cs="Times New Roman"/>
-                <w:sz w:val="24"/>
-                <w:szCs w:val="24"/>
-                <w:lang w:val="en-US"/>
-              </w:rPr>
-              <w:t>pytest-cov</w:t>
-            </w:r>
-            <w:r>
-              <w:rPr>
-                <w:rFonts w:ascii="Times New Roman" w:hAnsi="Times New Roman" w:cs="Times New Roman"/>
-                <w:sz w:val="24"/>
-                <w:szCs w:val="24"/>
+              <w:t>покрытия</w:t>
+            </w:r>
+            <w:r>
+              <w:rPr>
+                <w:rFonts w:ascii="Times New Roman" w:hAnsi="Times New Roman" w:cs="Times New Roman"/>
+                <w:sz w:val="24"/>
+                <w:szCs w:val="24"/>
+                <w:lang w:val="en-US"/>
+              </w:rPr>
+              <w:t xml:space="preserve"> </w:t>
+            </w:r>
+            <w:r>
+              <w:rPr>
+                <w:rFonts w:ascii="Times New Roman" w:hAnsi="Times New Roman" w:cs="Times New Roman"/>
+                <w:sz w:val="24"/>
+                <w:szCs w:val="24"/>
+              </w:rPr>
+              <w:t>кода</w:t>
+            </w:r>
+            <w:r>
+              <w:rPr>
+                <w:rFonts w:ascii="Times New Roman" w:hAnsi="Times New Roman" w:cs="Times New Roman"/>
+                <w:sz w:val="24"/>
+                <w:szCs w:val="24"/>
+                <w:lang w:val="en-US"/>
+              </w:rPr>
+              <w:t xml:space="preserve"> </w:t>
+            </w:r>
+            <w:r>
+              <w:rPr>
+                <w:rFonts w:ascii="Times New Roman" w:hAnsi="Times New Roman" w:cs="Times New Roman"/>
+                <w:sz w:val="24"/>
+                <w:szCs w:val="24"/>
+                <w:lang w:val="en-US"/>
+              </w:rPr>
+              <w:t>main</w:t>
+            </w:r>
+            <w:r>
+              <w:rPr>
+                <w:rFonts w:ascii="Times New Roman" w:hAnsi="Times New Roman" w:cs="Times New Roman"/>
+                <w:sz w:val="24"/>
+                <w:szCs w:val="24"/>
+                <w:lang w:val="en-US"/>
+              </w:rPr>
+              <w:t>.</w:t>
+            </w:r>
+            <w:r>
+              <w:rPr>
+                <w:rFonts w:ascii="Times New Roman" w:hAnsi="Times New Roman" w:cs="Times New Roman"/>
+                <w:sz w:val="24"/>
+                <w:szCs w:val="24"/>
+                <w:lang w:val="en-US"/>
+              </w:rPr>
+              <w:t xml:space="preserve">py </w:t>
+            </w:r>
+            <w:r>
+              <w:rPr>
+                <w:rFonts w:ascii="Times New Roman" w:hAnsi="Times New Roman" w:cs="Times New Roman"/>
+                <w:sz w:val="24"/>
+                <w:szCs w:val="24"/>
+                <w:lang w:val="en-US"/>
+              </w:rPr>
+              <w:t>(</w:t>
+            </w:r>
+            <w:proofErr w:type="spellStart"/>
+            <w:r>
+              <w:rPr>
+                <w:rFonts w:ascii="Times New Roman" w:hAnsi="Times New Roman" w:cs="Times New Roman"/>
+                <w:sz w:val="24"/>
+                <w:szCs w:val="24"/>
+                <w:lang w:val="en-US"/>
+              </w:rPr>
+              <w:t>pytest</w:t>
+            </w:r>
+            <w:r>
+              <w:rPr>
+                <w:rFonts w:ascii="Times New Roman" w:hAnsi="Times New Roman" w:cs="Times New Roman"/>
+                <w:sz w:val="24"/>
+                <w:szCs w:val="24"/>
+                <w:lang w:val="en-US"/>
+              </w:rPr>
+              <w:t>-</w:t>
+            </w:r>
+            <w:r>
+              <w:rPr>
+                <w:rFonts w:ascii="Times New Roman" w:hAnsi="Times New Roman" w:cs="Times New Roman"/>
+                <w:sz w:val="24"/>
+                <w:szCs w:val="24"/>
+                <w:lang w:val="en-US"/>
+              </w:rPr>
+              <w:t>cov</w:t>
+            </w:r>
+            <w:proofErr w:type="spellEnd"/>
+            <w:r>
+              <w:rPr>
+                <w:rFonts w:ascii="Times New Roman" w:hAnsi="Times New Roman" w:cs="Times New Roman"/>
+                <w:sz w:val="24"/>
+                <w:szCs w:val="24"/>
+                <w:lang w:val="en-US"/>
               </w:rPr>
               <w:t>)</w:t>
             </w:r>
@@ -297,9 +391,8 @@
                 <w:rFonts w:ascii="Times New Roman" w:hAnsi="Times New Roman" w:cs="Times New Roman"/>
                 <w:sz w:val="24"/>
                 <w:szCs w:val="24"/>
-                <w:lang w:val="en-US"/>
-              </w:rPr>
-              <w:t>92</w:t>
+              </w:rPr>
+              <w:t>91</w:t>
             </w:r>
           </w:p>
         </w:tc>
@@ -315,37 +408,140 @@
                 <w:rFonts w:ascii="Times New Roman" w:hAnsi="Times New Roman" w:cs="Times New Roman"/>
                 <w:sz w:val="24"/>
                 <w:szCs w:val="24"/>
-              </w:rPr>
-            </w:pPr>
-            <w:r>
-              <w:rPr>
-                <w:rFonts w:ascii="Times New Roman" w:hAnsi="Times New Roman" w:cs="Times New Roman"/>
-                <w:sz w:val="24"/>
-                <w:szCs w:val="24"/>
-              </w:rPr>
-              <w:t>Количество багов</w:t>
-            </w:r>
-          </w:p>
-        </w:tc>
-        <w:tc>
-          <w:tcPr>
-            <w:tcW w:w="4672" w:type="dxa"/>
-          </w:tcPr>
-          <w:p>
-            <w:pPr>
-              <w:rPr>
-                <w:rFonts w:ascii="Times New Roman" w:hAnsi="Times New Roman" w:cs="Times New Roman"/>
-                <w:sz w:val="24"/>
-                <w:szCs w:val="24"/>
-              </w:rPr>
-            </w:pPr>
-            <w:r>
-              <w:rPr>
-                <w:rFonts w:ascii="Times New Roman" w:hAnsi="Times New Roman" w:cs="Times New Roman"/>
-                <w:sz w:val="24"/>
-                <w:szCs w:val="24"/>
-              </w:rPr>
-              <w:t>0</w:t>
+                <w:lang w:val="en-US"/>
+              </w:rPr>
+            </w:pPr>
+            <w:r>
+              <w:rPr>
+                <w:rFonts w:ascii="Times New Roman" w:hAnsi="Times New Roman" w:cs="Times New Roman"/>
+                <w:sz w:val="24"/>
+                <w:szCs w:val="24"/>
+                <w:lang w:val="en-US"/>
+              </w:rPr>
+              <w:t xml:space="preserve">% </w:t>
+            </w:r>
+            <w:r>
+              <w:rPr>
+                <w:rFonts w:ascii="Times New Roman" w:hAnsi="Times New Roman" w:cs="Times New Roman"/>
+                <w:sz w:val="24"/>
+                <w:szCs w:val="24"/>
+              </w:rPr>
+              <w:t>покрытия</w:t>
+            </w:r>
+            <w:r>
+              <w:rPr>
+                <w:rFonts w:ascii="Times New Roman" w:hAnsi="Times New Roman" w:cs="Times New Roman"/>
+                <w:sz w:val="24"/>
+                <w:szCs w:val="24"/>
+                <w:lang w:val="en-US"/>
+              </w:rPr>
+              <w:t xml:space="preserve"> </w:t>
+            </w:r>
+            <w:r>
+              <w:rPr>
+                <w:rFonts w:ascii="Times New Roman" w:hAnsi="Times New Roman" w:cs="Times New Roman"/>
+                <w:sz w:val="24"/>
+                <w:szCs w:val="24"/>
+              </w:rPr>
+              <w:t>кода</w:t>
+            </w:r>
+            <w:r>
+              <w:rPr>
+                <w:rFonts w:ascii="Times New Roman" w:hAnsi="Times New Roman" w:cs="Times New Roman"/>
+                <w:sz w:val="24"/>
+                <w:szCs w:val="24"/>
+                <w:lang w:val="en-US"/>
+              </w:rPr>
+              <w:t xml:space="preserve"> detector</w:t>
+            </w:r>
+            <w:r>
+              <w:rPr>
+                <w:rFonts w:ascii="Times New Roman" w:hAnsi="Times New Roman" w:cs="Times New Roman"/>
+                <w:sz w:val="24"/>
+                <w:szCs w:val="24"/>
+                <w:lang w:val="en-US"/>
+              </w:rPr>
+              <w:t>.</w:t>
+            </w:r>
+            <w:r>
+              <w:rPr>
+                <w:rFonts w:ascii="Times New Roman" w:hAnsi="Times New Roman" w:cs="Times New Roman"/>
+                <w:sz w:val="24"/>
+                <w:szCs w:val="24"/>
+                <w:lang w:val="en-US"/>
+              </w:rPr>
+              <w:t xml:space="preserve">py </w:t>
+            </w:r>
+            <w:r>
+              <w:rPr>
+                <w:rFonts w:ascii="Times New Roman" w:hAnsi="Times New Roman" w:cs="Times New Roman"/>
+                <w:sz w:val="24"/>
+                <w:szCs w:val="24"/>
+                <w:lang w:val="en-US"/>
+              </w:rPr>
+              <w:t>(</w:t>
+            </w:r>
+            <w:proofErr w:type="spellStart"/>
+            <w:r>
+              <w:rPr>
+                <w:rFonts w:ascii="Times New Roman" w:hAnsi="Times New Roman" w:cs="Times New Roman"/>
+                <w:sz w:val="24"/>
+                <w:szCs w:val="24"/>
+                <w:lang w:val="en-US"/>
+              </w:rPr>
+              <w:t>pytest</w:t>
+            </w:r>
+            <w:r>
+              <w:rPr>
+                <w:rFonts w:ascii="Times New Roman" w:hAnsi="Times New Roman" w:cs="Times New Roman"/>
+                <w:sz w:val="24"/>
+                <w:szCs w:val="24"/>
+                <w:lang w:val="en-US"/>
+              </w:rPr>
+              <w:t>-</w:t>
+            </w:r>
+            <w:r>
+              <w:rPr>
+                <w:rFonts w:ascii="Times New Roman" w:hAnsi="Times New Roman" w:cs="Times New Roman"/>
+                <w:sz w:val="24"/>
+                <w:szCs w:val="24"/>
+                <w:lang w:val="en-US"/>
+              </w:rPr>
+              <w:t>cov</w:t>
+            </w:r>
+            <w:proofErr w:type="spellEnd"/>
+            <w:r>
+              <w:rPr>
+                <w:rFonts w:ascii="Times New Roman" w:hAnsi="Times New Roman" w:cs="Times New Roman"/>
+                <w:sz w:val="24"/>
+                <w:szCs w:val="24"/>
+                <w:lang w:val="en-US"/>
+              </w:rPr>
+              <w:t>)</w:t>
+            </w:r>
+          </w:p>
+        </w:tc>
+        <w:tc>
+          <w:tcPr>
+            <w:tcW w:w="4672" w:type="dxa"/>
+          </w:tcPr>
+          <w:p>
+            <w:pPr>
+              <w:rPr>
+                <w:rFonts w:ascii="Times New Roman" w:hAnsi="Times New Roman" w:cs="Times New Roman"/>
+                <w:sz w:val="24"/>
+                <w:szCs w:val="24"/>
+                <w:lang w:val="en-US"/>
+              </w:rPr>
+            </w:pPr>
+            <w:r>
+              <w:rPr>
+                <w:rFonts w:ascii="Times New Roman" w:hAnsi="Times New Roman" w:cs="Times New Roman"/>
+                <w:sz w:val="24"/>
+                <w:szCs w:val="24"/>
+                <w:lang w:val="en-US"/>
+              </w:rPr>
+              <w:t>100</w:t>
             </w:r>
           </w:p>
         </w:tc>
@@ -369,6 +565,52 @@
                 <w:sz w:val="24"/>
                 <w:szCs w:val="24"/>
               </w:rPr>
+              <w:t>Количество багов</w:t>
+            </w:r>
+          </w:p>
+        </w:tc>
+        <w:tc>
+          <w:tcPr>
+            <w:tcW w:w="4672" w:type="dxa"/>
+          </w:tcPr>
+          <w:p>
+            <w:pPr>
+              <w:rPr>
+                <w:rFonts w:ascii="Times New Roman" w:hAnsi="Times New Roman" w:cs="Times New Roman"/>
+                <w:sz w:val="24"/>
+                <w:szCs w:val="24"/>
+              </w:rPr>
+            </w:pPr>
+            <w:r>
+              <w:rPr>
+                <w:rFonts w:ascii="Times New Roman" w:hAnsi="Times New Roman" w:cs="Times New Roman"/>
+                <w:sz w:val="24"/>
+                <w:szCs w:val="24"/>
+              </w:rPr>
+              <w:t>0</w:t>
+            </w:r>
+          </w:p>
+        </w:tc>
+      </w:tr>
+      <w:tr>
+        <w:tc>
+          <w:tcPr>
+            <w:tcW w:w="4672" w:type="dxa"/>
+          </w:tcPr>
+          <w:p>
+            <w:pPr>
+              <w:rPr>
+                <w:rFonts w:ascii="Times New Roman" w:hAnsi="Times New Roman" w:cs="Times New Roman"/>
+                <w:sz w:val="24"/>
+                <w:szCs w:val="24"/>
+              </w:rPr>
+            </w:pPr>
+            <w:r>
+              <w:rPr>
+                <w:rFonts w:ascii="Times New Roman" w:hAnsi="Times New Roman" w:cs="Times New Roman"/>
+                <w:sz w:val="24"/>
+                <w:szCs w:val="24"/>
+              </w:rPr>
               <w:t>Среднее число тест-кейсов на метод</w:t>
             </w:r>
           </w:p>
@@ -383,21 +625,34 @@
                 <w:rFonts w:ascii="Times New Roman" w:hAnsi="Times New Roman" w:cs="Times New Roman"/>
                 <w:sz w:val="24"/>
                 <w:szCs w:val="24"/>
-              </w:rPr>
-            </w:pPr>
-            <w:r>
-              <w:rPr>
-                <w:rFonts w:ascii="Times New Roman" w:hAnsi="Times New Roman" w:cs="Times New Roman"/>
-                <w:sz w:val="24"/>
-                <w:szCs w:val="24"/>
-              </w:rPr>
-              <w:t>2.5</w:t>
+                <w:lang w:val="en-US"/>
+              </w:rPr>
+            </w:pPr>
+            <w:r>
+              <w:rPr>
+                <w:rFonts w:ascii="Times New Roman" w:hAnsi="Times New Roman" w:cs="Times New Roman"/>
+                <w:sz w:val="24"/>
+                <w:szCs w:val="24"/>
+              </w:rPr>
+              <w:t>1.</w:t>
+            </w:r>
+            <w:r>
+              <w:rPr>
+                <w:rFonts w:ascii="Times New Roman" w:hAnsi="Times New Roman" w:cs="Times New Roman"/>
+                <w:sz w:val="24"/>
+                <w:szCs w:val="24"/>
+                <w:lang w:val="en-US"/>
+              </w:rPr>
+              <w:t>875</w:t>
             </w:r>
           </w:p>
         </w:tc>
       </w:tr>
     </w:tbl>
-    <w:p/>
+    <w:p>
+      <w:bookmarkStart w:id="0" w:name="_GoBack"/>
+      <w:bookmarkEnd w:id="0"/>
+    </w:p>
     <w:tbl>
       <w:tblPr>
         <w:tblStyle w:val="a3"/>
@@ -445,7 +700,6 @@
                 <w:rFonts w:ascii="Times New Roman" w:hAnsi="Times New Roman" w:cs="Times New Roman"/>
                 <w:sz w:val="24"/>
                 <w:szCs w:val="24"/>
-                <w:lang w:val="en-US"/>
               </w:rPr>
             </w:pPr>
             <w:r>
@@ -493,20 +747,51 @@
                 <w:rFonts w:ascii="Times New Roman" w:hAnsi="Times New Roman" w:cs="Times New Roman"/>
                 <w:sz w:val="24"/>
                 <w:szCs w:val="24"/>
-                <w:lang w:val="en-US"/>
-              </w:rPr>
-            </w:pPr>
-            <w:proofErr w:type="spellStart"/>
-            <w:r>
-              <w:rPr>
-                <w:rFonts w:ascii="Times New Roman" w:hAnsi="Times New Roman" w:cs="Times New Roman"/>
-                <w:sz w:val="24"/>
-                <w:szCs w:val="24"/>
-                <w:lang w:val="en-US"/>
-              </w:rPr>
-              <w:t>get_requester_page</w:t>
-            </w:r>
-            <w:proofErr w:type="spellEnd"/>
+              </w:rPr>
+            </w:pPr>
+            <w:r>
+              <w:rPr>
+                <w:rFonts w:ascii="Times New Roman" w:hAnsi="Times New Roman" w:cs="Times New Roman"/>
+                <w:sz w:val="24"/>
+                <w:szCs w:val="24"/>
+                <w:lang w:val="en-US"/>
+              </w:rPr>
+              <w:t>get</w:t>
+            </w:r>
+            <w:r>
+              <w:rPr>
+                <w:rFonts w:ascii="Times New Roman" w:hAnsi="Times New Roman" w:cs="Times New Roman"/>
+                <w:sz w:val="24"/>
+                <w:szCs w:val="24"/>
+              </w:rPr>
+              <w:t>_</w:t>
+            </w:r>
+            <w:r>
+              <w:rPr>
+                <w:rFonts w:ascii="Times New Roman" w:hAnsi="Times New Roman" w:cs="Times New Roman"/>
+                <w:sz w:val="24"/>
+                <w:szCs w:val="24"/>
+                <w:lang w:val="en-US"/>
+              </w:rPr>
+              <w:t>requester</w:t>
+            </w:r>
+            <w:r>
+              <w:rPr>
+                <w:rFonts w:ascii="Times New Roman" w:hAnsi="Times New Roman" w:cs="Times New Roman"/>
+                <w:sz w:val="24"/>
+                <w:szCs w:val="24"/>
+              </w:rPr>
+              <w:t>_</w:t>
+            </w:r>
+            <w:r>
+              <w:rPr>
+                <w:rFonts w:ascii="Times New Roman" w:hAnsi="Times New Roman" w:cs="Times New Roman"/>
+                <w:sz w:val="24"/>
+                <w:szCs w:val="24"/>
+                <w:lang w:val="en-US"/>
+              </w:rPr>
+              <w:t>page</w:t>
+            </w:r>
           </w:p>
         </w:tc>
         <w:tc>
@@ -643,6 +928,110 @@
                 <w:rFonts w:ascii="Times New Roman" w:hAnsi="Times New Roman" w:cs="Times New Roman"/>
                 <w:sz w:val="24"/>
                 <w:szCs w:val="24"/>
+                <w:lang w:val="en-US"/>
+              </w:rPr>
+            </w:pPr>
+            <w:proofErr w:type="spellStart"/>
+            <w:r>
+              <w:rPr>
+                <w:rFonts w:ascii="Times New Roman" w:hAnsi="Times New Roman" w:cs="Times New Roman"/>
+                <w:sz w:val="24"/>
+                <w:szCs w:val="24"/>
+                <w:lang w:val="en-US"/>
+              </w:rPr>
+              <w:t>list_low_entropy</w:t>
+            </w:r>
+            <w:proofErr w:type="spellEnd"/>
+          </w:p>
+        </w:tc>
+        <w:tc>
+          <w:tcPr>
+            <w:tcW w:w="4673" w:type="dxa"/>
+          </w:tcPr>
+          <w:p>
+            <w:pPr>
+              <w:rPr>
+                <w:rFonts w:ascii="Times New Roman" w:hAnsi="Times New Roman" w:cs="Times New Roman"/>
+                <w:sz w:val="24"/>
+                <w:szCs w:val="24"/>
+                <w:lang w:val="en-US"/>
+              </w:rPr>
+            </w:pPr>
+            <w:r>
+              <w:rPr>
+                <w:rFonts w:ascii="Times New Roman" w:hAnsi="Times New Roman" w:cs="Times New Roman"/>
+                <w:sz w:val="24"/>
+                <w:szCs w:val="24"/>
+                <w:lang w:val="en-US"/>
+              </w:rPr>
+              <w:t>2</w:t>
+            </w:r>
+          </w:p>
+        </w:tc>
+      </w:tr>
+      <w:tr>
+        <w:tc>
+          <w:tcPr>
+            <w:tcW w:w="4672" w:type="dxa"/>
+          </w:tcPr>
+          <w:p>
+            <w:pPr>
+              <w:rPr>
+                <w:rFonts w:ascii="Times New Roman" w:hAnsi="Times New Roman" w:cs="Times New Roman"/>
+                <w:sz w:val="24"/>
+                <w:szCs w:val="24"/>
+                <w:lang w:val="en-US"/>
+              </w:rPr>
+            </w:pPr>
+            <w:proofErr w:type="spellStart"/>
+            <w:r>
+              <w:rPr>
+                <w:rFonts w:ascii="Times New Roman" w:hAnsi="Times New Roman" w:cs="Times New Roman"/>
+                <w:sz w:val="24"/>
+                <w:szCs w:val="24"/>
+                <w:lang w:val="en-US"/>
+              </w:rPr>
+              <w:t>russian_entropy</w:t>
+            </w:r>
+            <w:proofErr w:type="spellEnd"/>
+          </w:p>
+        </w:tc>
+        <w:tc>
+          <w:tcPr>
+            <w:tcW w:w="4673" w:type="dxa"/>
+          </w:tcPr>
+          <w:p>
+            <w:pPr>
+              <w:rPr>
+                <w:rFonts w:ascii="Times New Roman" w:hAnsi="Times New Roman" w:cs="Times New Roman"/>
+                <w:sz w:val="24"/>
+                <w:szCs w:val="24"/>
+                <w:lang w:val="en-US"/>
+              </w:rPr>
+            </w:pPr>
+            <w:r>
+              <w:rPr>
+                <w:rFonts w:ascii="Times New Roman" w:hAnsi="Times New Roman" w:cs="Times New Roman"/>
+                <w:sz w:val="24"/>
+                <w:szCs w:val="24"/>
+                <w:lang w:val="en-US"/>
+              </w:rPr>
+              <w:t>3</w:t>
+            </w:r>
+          </w:p>
+        </w:tc>
+      </w:tr>
+      <w:tr>
+        <w:tc>
+          <w:tcPr>
+            <w:tcW w:w="4672" w:type="dxa"/>
+          </w:tcPr>
+          <w:p>
+            <w:pPr>
+              <w:rPr>
+                <w:rFonts w:ascii="Times New Roman" w:hAnsi="Times New Roman" w:cs="Times New Roman"/>
+                <w:sz w:val="24"/>
+                <w:szCs w:val="24"/>
               </w:rPr>
             </w:pPr>
             <w:r>
@@ -673,7 +1062,7 @@
                 <w:sz w:val="24"/>
                 <w:szCs w:val="24"/>
               </w:rPr>
-              <w:t>10</w:t>
+              <w:t>15</w:t>
             </w:r>
           </w:p>
         </w:tc>
@@ -687,8 +1076,6 @@
           <w:szCs w:val="24"/>
         </w:rPr>
       </w:pPr>
-      <w:bookmarkStart w:id="0" w:name="_GoBack"/>
-      <w:bookmarkEnd w:id="0"/>
     </w:p>
     <w:sectPr>
       <w:pgSz w:w="11906" w:h="16838"/>

</xml_diff>